<commit_message>
Previously, the MaintenanceForm would blindly default to the current calendar quarter, ignoring which quarter tab the user was actually viewing on the MaintenancePage.
This update synchronizes the form with the user's active view:
- Added a `selectedQuarter` prop to the `MaintenanceForm` component.
- Updated the form's initial state logic to prioritize the passed
  prop over the `getCurrentQuarter()` fallback function.
- Passed the `selectedQuarter` state from `MaintenancePage` down
  into the form component.

This ensures that if a user is viewing historical data (e.g., Q1)
and clicks to edit/create a report, the form will automatically
lock onto Q1, improving UX and preventing accidental data entry
into the wrong quarter.
</commit_message>
<xml_diff>
--- a/frontend/public/inventory_template.docx
+++ b/frontend/public/inventory_template.docx
@@ -456,8 +456,6 @@
               </w:rPr>
               <w:t>{location}</w:t>
             </w:r>
-            <w:bookmarkStart w:id="1" w:name="_GoBack"/>
-            <w:bookmarkEnd w:id="1"/>
           </w:p>
         </w:tc>
       </w:tr>
@@ -478,6 +476,8 @@
       <w:r>
         <w:t>{#workstations}</w:t>
       </w:r>
+      <w:bookmarkStart w:id="1" w:name="_GoBack"/>
+      <w:bookmarkEnd w:id="1"/>
     </w:p>
     <w:tbl>
       <w:tblPr>
@@ -488,11 +488,11 @@
         <w:tblLook w:val="0600" w:firstRow="0" w:lastRow="0" w:firstColumn="0" w:lastColumn="0" w:noHBand="1" w:noVBand="1"/>
       </w:tblPr>
       <w:tblGrid>
-        <w:gridCol w:w="2695"/>
-        <w:gridCol w:w="1620"/>
+        <w:gridCol w:w="1075"/>
         <w:gridCol w:w="1530"/>
-        <w:gridCol w:w="2975"/>
-        <w:gridCol w:w="2075"/>
+        <w:gridCol w:w="1530"/>
+        <w:gridCol w:w="4500"/>
+        <w:gridCol w:w="2260"/>
       </w:tblGrid>
       <w:tr>
         <w:trPr>
@@ -502,7 +502,7 @@
         </w:trPr>
         <w:tc>
           <w:tcPr>
-            <w:tcW w:w="2695" w:type="dxa"/>
+            <w:tcW w:w="1075" w:type="dxa"/>
             <w:tcBorders>
               <w:top w:val="single" w:sz="4" w:space="0" w:color="000000"/>
               <w:left w:val="single" w:sz="4" w:space="0" w:color="000000"/>
@@ -532,7 +532,7 @@
         </w:tc>
         <w:tc>
           <w:tcPr>
-            <w:tcW w:w="1620" w:type="dxa"/>
+            <w:tcW w:w="1530" w:type="dxa"/>
             <w:tcBorders>
               <w:top w:val="single" w:sz="4" w:space="0" w:color="000000"/>
               <w:left w:val="single" w:sz="4" w:space="0" w:color="000000"/>
@@ -604,7 +604,7 @@
         </w:tc>
         <w:tc>
           <w:tcPr>
-            <w:tcW w:w="2975" w:type="dxa"/>
+            <w:tcW w:w="4500" w:type="dxa"/>
             <w:tcBorders>
               <w:top w:val="single" w:sz="6" w:space="0" w:color="000000"/>
               <w:left w:val="single" w:sz="6" w:space="0" w:color="CCCCCC"/>
@@ -640,7 +640,7 @@
         </w:tc>
         <w:tc>
           <w:tcPr>
-            <w:tcW w:w="2075" w:type="dxa"/>
+            <w:tcW w:w="2260" w:type="dxa"/>
             <w:tcBorders>
               <w:top w:val="single" w:sz="6" w:space="0" w:color="000000"/>
               <w:left w:val="single" w:sz="6" w:space="0" w:color="CCCCCC"/>
@@ -676,7 +676,7 @@
         </w:trPr>
         <w:tc>
           <w:tcPr>
-            <w:tcW w:w="2695" w:type="dxa"/>
+            <w:tcW w:w="1075" w:type="dxa"/>
             <w:tcBorders>
               <w:top w:val="single" w:sz="4" w:space="0" w:color="000000"/>
               <w:left w:val="single" w:sz="4" w:space="0" w:color="000000"/>
@@ -732,7 +732,7 @@
         </w:tc>
         <w:tc>
           <w:tcPr>
-            <w:tcW w:w="1620" w:type="dxa"/>
+            <w:tcW w:w="1530" w:type="dxa"/>
             <w:tcBorders>
               <w:top w:val="single" w:sz="4" w:space="0" w:color="000000"/>
               <w:left w:val="single" w:sz="4" w:space="0" w:color="000000"/>
@@ -840,7 +840,7 @@
         </w:tc>
         <w:tc>
           <w:tcPr>
-            <w:tcW w:w="2975" w:type="dxa"/>
+            <w:tcW w:w="4500" w:type="dxa"/>
             <w:tcBorders>
               <w:top w:val="single" w:sz="6" w:space="0" w:color="CCCCCC"/>
               <w:left w:val="single" w:sz="6" w:space="0" w:color="CCCCCC"/>
@@ -876,7 +876,7 @@
         </w:tc>
         <w:tc>
           <w:tcPr>
-            <w:tcW w:w="2075" w:type="dxa"/>
+            <w:tcW w:w="2260" w:type="dxa"/>
             <w:tcBorders>
               <w:top w:val="single" w:sz="6" w:space="0" w:color="CCCCCC"/>
               <w:left w:val="single" w:sz="6" w:space="0" w:color="CCCCCC"/>

</xml_diff>